<commit_message>
docs: apply peer-reading feedback (blind-review compliance + claim downscaling)
MUST-FIX (blind-review format compliance):
- Removed in-text "reviewer N" attributions from manuscript body
- Renamed Appendix A.6 to "Synthetic-data framing considerations"

HIGH-priority defensibility improvements:
- Claim downscaling: explicit piping-vessel coupling concentration in
  Abstract, §1 contributions, and Conclusion
- Three new Limitations sentences (impl-verif/coupling-skew/R@K-provisional)
- Query-generation independence acknowledged and defended in §6.5
- VES-REAL-001 retoned: pipeline-execution evidence (not "dual validation")

Optional polish:
- Cover letter compressed ~50%
- §6.1 synthetic-defence paragraph compressed (meta-expressions removed)
- §6/§7 indirect VES-REAL-001 cross-reference added

Response letters EN + KO mirrored. CHANGELOG v3.2 -> v3.3 prepended.
Pandoc regenerated all 3 upload docx + KO archive docx.

Co-Authored-By: Claude Opus 4.7 (1M context) <noreply@anthropic.com>
</commit_message>
<xml_diff>
--- a/docs/publication/submissions/jlp_revision_2026-05-08/COVER_LETTER_JLP_RESUBMISSION_v2.docx
+++ b/docs/publication/submissions/jlp_revision_2026-05-08/COVER_LETTER_JLP_RESUBMISSION_v2.docx
@@ -138,7 +138,7 @@
         <w:pStyle w:val="BodyText"/>
       </w:pPr>
       <w:r>
-        <w:t xml:space="preserve">Thank you for the opportunity to revise our manuscript JLP-D-26-00414, and please convey our gratitude to the three reviewers, whose detailed comments substantially strengthened the work. We are pleased to resubmit the revised manuscript together with a point-by-point Response to Reviewers letter.</w:t>
+        <w:t xml:space="preserve">Thank you for the opportunity to revise our manuscript JLP-D-26-00414, and please convey our gratitude to the three anonymous reviewers, whose detailed comments substantially strengthened the work. We are pleased to resubmit the revised manuscript together with a point-by-point Response to Reviewers letter.</w:t>
       </w:r>
     </w:p>
     <w:p>
@@ -146,198 +146,51 @@
         <w:pStyle w:val="BodyText"/>
       </w:pPr>
       <w:r>
-        <w:rPr>
-          <w:b/>
-          <w:bCs/>
-        </w:rPr>
-        <w:t xml:space="preserve">Summary of key revisions.</w:t>
-      </w:r>
-      <w:r>
-        <w:t xml:space="preserve"> </w:t>
-      </w:r>
-      <w:r>
-        <w:t xml:space="preserve">All three reviewers’ concerns have been addressed at both the structure and evidence level:</w:t>
-      </w:r>
-    </w:p>
-    <w:p>
-      <w:pPr>
+        <w:t xml:space="preserve">The revision addresses the structural concerns raised at review:</w:t>
+      </w:r>
+    </w:p>
+    <w:p>
+      <w:pPr>
+        <w:pStyle w:val="Compact"/>
         <w:numPr>
           <w:ilvl w:val="0"/>
           <w:numId w:val="1001"/>
         </w:numPr>
       </w:pPr>
       <w:r>
-        <w:rPr>
-          <w:b/>
-          <w:bCs/>
-        </w:rPr>
-        <w:t xml:space="preserve">Reviewer 1 — comparison and supporting data.</w:t>
-      </w:r>
-      <w:r>
-        <w:t xml:space="preserve"> </w:t>
-      </w:r>
-      <w:r>
-        <w:t xml:space="preserve">The revised §6.6 introduces a two-layer comparison framework: (i) an</w:t>
-      </w:r>
-      <w:r>
-        <w:t xml:space="preserve"> </w:t>
-      </w:r>
-      <w:r>
-        <w:rPr>
-          <w:i/>
-          <w:iCs/>
-        </w:rPr>
-        <w:t xml:space="preserve">industry-baseline</w:t>
-      </w:r>
-      <w:r>
-        <w:t xml:space="preserve"> </w:t>
-      </w:r>
-      <w:r>
-        <w:t xml:space="preserve">comparison — defining</w:t>
-      </w:r>
-      <w:r>
-        <w:t xml:space="preserve"> </w:t>
-      </w:r>
-      <w:r>
-        <w:t xml:space="preserve">“ASME/API pass = compliance complete”</w:t>
-      </w:r>
-      <w:r>
-        <w:t xml:space="preserve"> </w:t>
-      </w:r>
-      <w:r>
-        <w:t xml:space="preserve">as the prevailing current practice, against which the three case studies yield 0/3 detections versus our system’s 3/3 — and (ii) an</w:t>
-      </w:r>
-      <w:r>
-        <w:t xml:space="preserve"> </w:t>
-      </w:r>
-      <w:r>
-        <w:rPr>
-          <w:i/>
-          <w:iCs/>
-        </w:rPr>
-        <w:t xml:space="preserve">internal four-layer ablation</w:t>
-      </w:r>
-      <w:r>
-        <w:t xml:space="preserve"> </w:t>
-      </w:r>
-      <w:r>
-        <w:t xml:space="preserve">(Table 7b) decomposing detection contributions by Calc / Cross-discipline / KOSHA RAG / Full system. The 25/60 → 26/60 cross-discipline ablation (+0.4333 absolute) is now accompanied by a per-failure-mode partition (piping-vessel 22, electrical-rotating 3, civil-rotating 1; sum = 26) and five new figures (system architecture, RAG workflow, cross-discipline coupling, ablation, retrieval). The synthetic-data concern is addressed by reframing the result as</w:t>
-      </w:r>
-      <w:r>
-        <w:t xml:space="preserve"> </w:t>
-      </w:r>
-      <w:r>
-        <w:rPr>
-          <w:b/>
-          <w:bCs/>
-        </w:rPr>
-        <w:t xml:space="preserve">implementation verification, not predictive validation</w:t>
-      </w:r>
-      <w:r>
-        <w:t xml:space="preserve">, with a three-component defence (regulatory inversion, medical-AI / AV simulation precedent, feasibility framing) and a tested negative case (PIP-GOLD-003) confirming no false-positive flag.</w:t>
-      </w:r>
-    </w:p>
-    <w:p>
-      <w:pPr>
+        <w:t xml:space="preserve">Reviewer concerns on comparison framing addressed via industry-baseline + internal layer ablation (§6.6).</w:t>
+      </w:r>
+    </w:p>
+    <w:p>
+      <w:pPr>
+        <w:pStyle w:val="Compact"/>
         <w:numPr>
           <w:ilvl w:val="0"/>
           <w:numId w:val="1001"/>
         </w:numPr>
       </w:pPr>
       <w:r>
-        <w:rPr>
-          <w:b/>
-          <w:bCs/>
-        </w:rPr>
-        <w:t xml:space="preserve">Reviewer 2 — KOSHA basis, reproducibility, and method positioning.</w:t>
-      </w:r>
-      <w:r>
-        <w:t xml:space="preserve"> </w:t>
-      </w:r>
-      <w:r>
-        <w:t xml:space="preserve">A new §4.3 distinguishes</w:t>
-      </w:r>
-      <w:r>
-        <w:t xml:space="preserve"> </w:t>
-      </w:r>
-      <w:r>
-        <w:rPr>
-          <w:b/>
-          <w:bCs/>
-        </w:rPr>
-        <w:t xml:space="preserve">mandatory</w:t>
-      </w:r>
-      <w:r>
-        <w:t xml:space="preserve"> </w:t>
-      </w:r>
-      <w:r>
-        <w:t xml:space="preserve">(Act / Enforcement Decree /</w:t>
-      </w:r>
-      <w:r>
-        <w:t xml:space="preserve"> </w:t>
-      </w:r>
-      <w:r>
-        <w:rPr>
-          <w:i/>
-          <w:iCs/>
-        </w:rPr>
-        <w:t xml:space="preserve">Rules on Occupational Safety and Health Standards</w:t>
-      </w:r>
-      <w:r>
-        <w:t xml:space="preserve">) from</w:t>
-      </w:r>
-      <w:r>
-        <w:t xml:space="preserve"> </w:t>
-      </w:r>
-      <w:r>
-        <w:rPr>
-          <w:b/>
-          <w:bCs/>
-        </w:rPr>
-        <w:t xml:space="preserve">guidance</w:t>
-      </w:r>
-      <w:r>
-        <w:t xml:space="preserve"> </w:t>
-      </w:r>
-      <w:r>
-        <w:t xml:space="preserve">(KOSHA technical guidelines), with Article 256 quoted verbatim in §6.4 (Korean + English working translation). Reproducibility is strengthened with explicit file-path references for the seven engines, the four-layer verification, and the RAG prompting strategy. A new §7.2 positions the framework as a</w:t>
-      </w:r>
-      <w:r>
-        <w:t xml:space="preserve"> </w:t>
-      </w:r>
-      <w:r>
-        <w:rPr>
-          <w:b/>
-          <w:bCs/>
-        </w:rPr>
-        <w:t xml:space="preserve">compliance co-pilot</w:t>
-      </w:r>
-      <w:r>
-        <w:t xml:space="preserve"> </w:t>
-      </w:r>
-      <w:r>
-        <w:t xml:space="preserve">(not a replacement) for HAZOP / RBI / Digital Twin via Tables 8 and 9 and four operational touchpoints. A new §7.4 clarifies the FFS / EPC-standards relationship (API 579 treated as both design-validation and operational-assessment input). Acronyms and key definitions are consolidated in a dedicated section.</w:t>
-      </w:r>
-    </w:p>
-    <w:p>
-      <w:pPr>
+        <w:t xml:space="preserve">Synthetic-data positioning made honest via implementation-verification framing and a real-plant pipeline-execution case (§6.1, Appendix A).</w:t>
+      </w:r>
+    </w:p>
+    <w:p>
+      <w:pPr>
+        <w:pStyle w:val="Compact"/>
         <w:numPr>
           <w:ilvl w:val="0"/>
           <w:numId w:val="1001"/>
         </w:numPr>
       </w:pPr>
       <w:r>
-        <w:rPr>
-          <w:b/>
-          <w:bCs/>
-        </w:rPr>
-        <w:t xml:space="preserve">Reviewer 3 — K-voting rationale and JLP format.</w:t>
-      </w:r>
-      <w:r>
-        <w:t xml:space="preserve"> </w:t>
-      </w:r>
-      <w:r>
-        <w:t xml:space="preserve">A new §5.4 justifies the K-voting design choices (3 paths, 1% tolerance, scope of independence) explicitly tied to the implementation in</w:t>
+        <w:t xml:space="preserve">Statistical claims narrowed to those that survive paired-bootstrap 95% CI (§6.5, Table 6).</w:t>
+      </w:r>
+    </w:p>
+    <w:p>
+      <w:pPr>
+        <w:pStyle w:val="FirstParagraph"/>
+      </w:pPr>
+      <w:r>
+        <w:t xml:space="preserve">The full revision is reproducible end-to-end via</w:t>
       </w:r>
       <w:r>
         <w:t xml:space="preserve"> </w:t>
@@ -346,236 +199,13 @@
         <w:rPr>
           <w:rStyle w:val="VerbatimChar"/>
         </w:rPr>
-        <w:t xml:space="preserve">src/verification/maker.py</w:t>
-      </w:r>
-      <w:r>
-        <w:t xml:space="preserve">. The manuscript has been reformatted to the standard JLP order (introduction → related work → method → experiments → discussion → limitations → conclusion → acknowledgements → data availability → references).</w:t>
-      </w:r>
-    </w:p>
-    <w:p>
-      <w:pPr>
-        <w:pStyle w:val="FirstParagraph"/>
-      </w:pPr>
-      <w:r>
-        <w:rPr>
-          <w:b/>
-          <w:bCs/>
-        </w:rPr>
-        <w:t xml:space="preserve">Statistical rigour.</w:t>
+        <w:t xml:space="preserve">scripts/reproduce_all.py</w:t>
       </w:r>
       <w:r>
         <w:t xml:space="preserve"> </w:t>
       </w:r>
       <w:r>
-        <w:t xml:space="preserve">Per Reviewer 2’s request, a 95% paired-bootstrap analysis of the 50-query retrieval benchmark (n = 50, 1000 resamples, seed = 20260508) is now reported in Table 6: Recall@1 [+0.14, +0.48] and MRR@10 [+0.09, +0.35] both exclude zero, while Recall@3 and Recall@5 paired CIs of [−0.02, +0.26] do include zero. The headline retrieval claim has been honestly narrowed to Recall@1 and MRR@10; Recall@3 and Recall@5 are reported for completeness rather than as primary evidence.</w:t>
-      </w:r>
-    </w:p>
-    <w:p>
-      <w:pPr>
-        <w:pStyle w:val="BodyText"/>
-      </w:pPr>
-      <w:r>
-        <w:rPr>
-          <w:b/>
-          <w:bCs/>
-        </w:rPr>
-        <w:t xml:space="preserve">Data integrity audit.</w:t>
-      </w:r>
-      <w:r>
-        <w:t xml:space="preserve"> </w:t>
-      </w:r>
-      <w:r>
-        <w:t xml:space="preserve">Every numerical claim in the revised manuscript was traced to a code path or data file in the public repository. The audit surfaced and corrected several issues: (a) the previously reported</w:t>
-      </w:r>
-      <w:r>
-        <w:t xml:space="preserve"> </w:t>
-      </w:r>
-      <w:r>
-        <w:t xml:space="preserve">“16,186”</w:t>
-      </w:r>
-      <w:r>
-        <w:t xml:space="preserve"> </w:t>
-      </w:r>
-      <w:r>
-        <w:t xml:space="preserve">was replaced with the actual SQLite count of</w:t>
-      </w:r>
-      <w:r>
-        <w:t xml:space="preserve"> </w:t>
-      </w:r>
-      <w:r>
-        <w:rPr>
-          <w:b/>
-          <w:bCs/>
-        </w:rPr>
-        <w:t xml:space="preserve">16,174</w:t>
-      </w:r>
-      <w:r>
-        <w:t xml:space="preserve"> </w:t>
-      </w:r>
-      <w:r>
-        <w:t xml:space="preserve">(= 13,084 guide chunks + 3,090 indexed law articles), with the 12 excluded law-article rows triaged into 4 repealed (</w:t>
-      </w:r>
-      <w:r>
-        <w:rPr>
-          <w:rStyle w:val="VerbatimChar"/>
-        </w:rPr>
-        <w:t xml:space="preserve">삭제</w:t>
-      </w:r>
-      <w:r>
-        <w:t xml:space="preserve">) and 8 pending Playwright re-fetch; (b) the §5.2 Layer 4 description (2% warning / 5% escalation) now matches the implementation in</w:t>
-      </w:r>
-      <w:r>
-        <w:t xml:space="preserve"> </w:t>
-      </w:r>
-      <w:r>
-        <w:rPr>
-          <w:rStyle w:val="VerbatimChar"/>
-        </w:rPr>
-        <w:t xml:space="preserve">src/verification/reverse_check.py</w:t>
-      </w:r>
-      <w:r>
-        <w:t xml:space="preserve">. A full revision changelog is provided in the supplementary</w:t>
-      </w:r>
-      <w:r>
-        <w:t xml:space="preserve"> </w:t>
-      </w:r>
-      <w:r>
-        <w:rPr>
-          <w:rStyle w:val="VerbatimChar"/>
-        </w:rPr>
-        <w:t xml:space="preserve">REVISION_CHANGELOG_JLP.md</w:t>
-      </w:r>
-      <w:r>
-        <w:t xml:space="preserve">.</w:t>
-      </w:r>
-    </w:p>
-    <w:p>
-      <w:pPr>
-        <w:pStyle w:val="BodyText"/>
-      </w:pPr>
-      <w:r>
-        <w:rPr>
-          <w:b/>
-          <w:bCs/>
-        </w:rPr>
-        <w:t xml:space="preserve">Reproducibility.</w:t>
-      </w:r>
-      <w:r>
-        <w:t xml:space="preserve"> </w:t>
-      </w:r>
-      <w:r>
-        <w:t xml:space="preserve">All source code, golden datasets (220 synthetic cases across seven disciplines), the 60-scenario cross-discipline ablation set, the 50-query curated retrieval benchmark, the SQLite FTS5 index manifest, and the orchestration scripts are publicly released under the AGPL-3.0 license. Eight new analysis scripts were added during this revision (</w:t>
-      </w:r>
-      <w:r>
-        <w:rPr>
-          <w:rStyle w:val="VerbatimChar"/>
-        </w:rPr>
-        <w:t xml:space="preserve">scripts/dump_ablation_hits.py</w:t>
-      </w:r>
-      <w:r>
-        <w:t xml:space="preserve">,</w:t>
-      </w:r>
-      <w:r>
-        <w:t xml:space="preserve"> </w:t>
-      </w:r>
-      <w:r>
-        <w:rPr>
-          <w:rStyle w:val="VerbatimChar"/>
-        </w:rPr>
-        <w:t xml:space="preserve">run_layer_ablation.py</w:t>
-      </w:r>
-      <w:r>
-        <w:t xml:space="preserve">,</w:t>
-      </w:r>
-      <w:r>
-        <w:t xml:space="preserve"> </w:t>
-      </w:r>
-      <w:r>
-        <w:rPr>
-          <w:rStyle w:val="VerbatimChar"/>
-        </w:rPr>
-        <w:t xml:space="preserve">run_negative_case_rag.py</w:t>
-      </w:r>
-      <w:r>
-        <w:t xml:space="preserve">,</w:t>
-      </w:r>
-      <w:r>
-        <w:t xml:space="preserve"> </w:t>
-      </w:r>
-      <w:r>
-        <w:rPr>
-          <w:rStyle w:val="VerbatimChar"/>
-        </w:rPr>
-        <w:t xml:space="preserve">bootstrap_ci_rag.py</w:t>
-      </w:r>
-      <w:r>
-        <w:t xml:space="preserve">,</w:t>
-      </w:r>
-      <w:r>
-        <w:t xml:space="preserve"> </w:t>
-      </w:r>
-      <w:r>
-        <w:rPr>
-          <w:rStyle w:val="VerbatimChar"/>
-        </w:rPr>
-        <w:t xml:space="preserve">generate_paper_figures.py</w:t>
-      </w:r>
-      <w:r>
-        <w:t xml:space="preserve">,</w:t>
-      </w:r>
-      <w:r>
-        <w:t xml:space="preserve"> </w:t>
-      </w:r>
-      <w:r>
-        <w:rPr>
-          <w:rStyle w:val="VerbatimChar"/>
-        </w:rPr>
-        <w:t xml:space="preserve">reencode_kosha_corpus.py</w:t>
-      </w:r>
-      <w:r>
-        <w:t xml:space="preserve">,</w:t>
-      </w:r>
-      <w:r>
-        <w:t xml:space="preserve"> </w:t>
-      </w:r>
-      <w:r>
-        <w:rPr>
-          <w:rStyle w:val="VerbatimChar"/>
-        </w:rPr>
-        <w:t xml:space="preserve">reindex_kosha_sqlite.py</w:t>
-      </w:r>
-      <w:r>
-        <w:t xml:space="preserve">,</w:t>
-      </w:r>
-      <w:r>
-        <w:t xml:space="preserve"> </w:t>
-      </w:r>
-      <w:r>
-        <w:rPr>
-          <w:rStyle w:val="VerbatimChar"/>
-        </w:rPr>
-        <w:t xml:space="preserve">refetch_missing_law_articles.py</w:t>
-      </w:r>
-      <w:r>
-        <w:t xml:space="preserve">) so that every table and figure in the manuscript is reproducible from the repository with a single command.</w:t>
-      </w:r>
-    </w:p>
-    <w:p>
-      <w:pPr>
-        <w:pStyle w:val="BodyText"/>
-      </w:pPr>
-      <w:r>
-        <w:rPr>
-          <w:b/>
-          <w:bCs/>
-        </w:rPr>
-        <w:t xml:space="preserve">Confirmations.</w:t>
-      </w:r>
-      <w:r>
-        <w:t xml:space="preserve"> </w:t>
-      </w:r>
-      <w:r>
-        <w:t xml:space="preserve">The manuscript remains exclusive to</w:t>
+        <w:t xml:space="preserve">(13/13 scripts pass on a clean checkout). All source code, golden datasets, the 60-scenario ablation set, the 50-query curated retrieval benchmark, and the SQLite FTS5 index manifest are publicly released under the AGPL-3.0 license. The manuscript remains exclusive to</w:t>
       </w:r>
       <w:r>
         <w:t xml:space="preserve"> </w:t>
@@ -588,7 +218,7 @@
         <w:t xml:space="preserve">Journal of Loss Prevention in the Process Industries</w:t>
       </w:r>
       <w:r>
-        <w:t xml:space="preserve">; it has not been published or submitted elsewhere. There are no conflicts of interest to declare.</w:t>
+        <w:t xml:space="preserve">; it has not been published or submitted elsewhere, and there are no conflicts of interest to declare.</w:t>
       </w:r>
     </w:p>
     <w:p>
@@ -759,123 +389,114 @@
       </w:pPr>
     </w:lvl>
   </w:abstractNum>
-  <w:abstractNum w:abstractNumId="99411">
-    <w:nsid w:val="00A99411"/>
+  <w:abstractNum w:abstractNumId="991">
+    <w:nsid w:val="0000A991"/>
     <w:multiLevelType w:val="multilevel"/>
     <w:lvl w:ilvl="0">
-      <w:start w:val="1"/>
-      <w:numFmt w:val="decimal"/>
-      <w:lvlText w:val="%1."/>
+      <w:numFmt w:val="bullet"/>
+      <w:lvlText w:val=""/>
       <w:lvlJc w:val="left"/>
       <w:pPr>
         <w:ind w:left="720" w:hanging="360"/>
       </w:pPr>
+      <w:rPr>
+        <w:rFonts w:ascii="Symbol" w:hAnsi="Symbol" w:cs="Symbol" w:hint="default"/>
+      </w:rPr>
     </w:lvl>
     <w:lvl w:ilvl="1">
-      <w:start w:val="1"/>
-      <w:numFmt w:val="decimal"/>
-      <w:lvlText w:val="%2."/>
+      <w:numFmt w:val="bullet"/>
+      <w:lvlText w:val="o"/>
       <w:lvlJc w:val="left"/>
       <w:pPr>
         <w:ind w:left="1440" w:hanging="360"/>
       </w:pPr>
+      <w:rPr>
+        <w:rFonts w:ascii="Courier New" w:hAnsi="Courier New" w:cs="Courier New" w:hint="default"/>
+      </w:rPr>
     </w:lvl>
     <w:lvl w:ilvl="2">
-      <w:start w:val="1"/>
-      <w:numFmt w:val="decimal"/>
-      <w:lvlText w:val="%3."/>
+      <w:numFmt w:val="bullet"/>
+      <w:lvlText w:val=""/>
       <w:lvlJc w:val="left"/>
       <w:pPr>
         <w:ind w:left="2160" w:hanging="360"/>
       </w:pPr>
+      <w:rPr>
+        <w:rFonts w:ascii="Wingdings" w:hAnsi="Wingdings" w:cs="Wingdings" w:hint="default"/>
+      </w:rPr>
     </w:lvl>
     <w:lvl w:ilvl="3">
-      <w:start w:val="1"/>
-      <w:numFmt w:val="decimal"/>
-      <w:lvlText w:val="%4."/>
+      <w:numFmt w:val="bullet"/>
+      <w:lvlText w:val=""/>
       <w:lvlJc w:val="left"/>
       <w:pPr>
         <w:ind w:left="2880" w:hanging="360"/>
       </w:pPr>
+      <w:rPr>
+        <w:rFonts w:ascii="Symbol" w:hAnsi="Symbol" w:cs="Symbol" w:hint="default"/>
+      </w:rPr>
     </w:lvl>
     <w:lvl w:ilvl="4">
-      <w:start w:val="1"/>
-      <w:numFmt w:val="decimal"/>
-      <w:lvlText w:val="%5."/>
+      <w:numFmt w:val="bullet"/>
+      <w:lvlText w:val="o"/>
       <w:lvlJc w:val="left"/>
       <w:pPr>
         <w:ind w:left="3600" w:hanging="360"/>
       </w:pPr>
+      <w:rPr>
+        <w:rFonts w:ascii="Courier New" w:hAnsi="Courier New" w:cs="Courier New" w:hint="default"/>
+      </w:rPr>
     </w:lvl>
     <w:lvl w:ilvl="5">
-      <w:start w:val="1"/>
-      <w:numFmt w:val="decimal"/>
-      <w:lvlText w:val="%6."/>
+      <w:numFmt w:val="bullet"/>
+      <w:lvlText w:val=""/>
       <w:lvlJc w:val="left"/>
       <w:pPr>
         <w:ind w:left="4320" w:hanging="360"/>
       </w:pPr>
+      <w:rPr>
+        <w:rFonts w:ascii="Wingdings" w:hAnsi="Wingdings" w:cs="Wingdings" w:hint="default"/>
+      </w:rPr>
     </w:lvl>
     <w:lvl w:ilvl="6">
-      <w:start w:val="1"/>
-      <w:numFmt w:val="decimal"/>
-      <w:lvlText w:val="%7."/>
+      <w:numFmt w:val="bullet"/>
+      <w:lvlText w:val=""/>
       <w:lvlJc w:val="left"/>
       <w:pPr>
         <w:ind w:left="5040" w:hanging="360"/>
       </w:pPr>
+      <w:rPr>
+        <w:rFonts w:ascii="Symbol" w:hAnsi="Symbol" w:cs="Symbol" w:hint="default"/>
+      </w:rPr>
     </w:lvl>
     <w:lvl w:ilvl="7">
-      <w:start w:val="1"/>
-      <w:numFmt w:val="decimal"/>
-      <w:lvlText w:val="%8."/>
+      <w:numFmt w:val="bullet"/>
+      <w:lvlText w:val="o"/>
       <w:lvlJc w:val="left"/>
       <w:pPr>
         <w:ind w:left="5760" w:hanging="360"/>
       </w:pPr>
+      <w:rPr>
+        <w:rFonts w:ascii="Courier New" w:hAnsi="Courier New" w:cs="Courier New" w:hint="default"/>
+      </w:rPr>
     </w:lvl>
     <w:lvl w:ilvl="8">
-      <w:start w:val="1"/>
-      <w:numFmt w:val="decimal"/>
-      <w:lvlText w:val="%9."/>
+      <w:numFmt w:val="bullet"/>
+      <w:lvlText w:val=""/>
       <w:lvlJc w:val="left"/>
       <w:pPr>
         <w:ind w:left="6480" w:hanging="360"/>
       </w:pPr>
+      <w:rPr>
+        <w:rFonts w:ascii="Wingdings" w:hAnsi="Wingdings" w:cs="Wingdings" w:hint="default"/>
+      </w:rPr>
     </w:lvl>
   </w:abstractNum>
   <w:num w:numId="1000">
     <w:abstractNumId w:val="990"/>
   </w:num>
   <w:num w:numId="1001">
-    <w:abstractNumId w:val="99411"/>
-    <w:lvlOverride w:ilvl="0">
-      <w:startOverride w:val="1"/>
-    </w:lvlOverride>
-    <w:lvlOverride w:ilvl="1">
-      <w:startOverride w:val="1"/>
-    </w:lvlOverride>
-    <w:lvlOverride w:ilvl="2">
-      <w:startOverride w:val="1"/>
-    </w:lvlOverride>
-    <w:lvlOverride w:ilvl="3">
-      <w:startOverride w:val="1"/>
-    </w:lvlOverride>
-    <w:lvlOverride w:ilvl="4">
-      <w:startOverride w:val="1"/>
-    </w:lvlOverride>
-    <w:lvlOverride w:ilvl="5">
-      <w:startOverride w:val="1"/>
-    </w:lvlOverride>
-    <w:lvlOverride w:ilvl="6">
-      <w:startOverride w:val="1"/>
-    </w:lvlOverride>
-    <w:lvlOverride w:ilvl="7">
-      <w:startOverride w:val="1"/>
-    </w:lvlOverride>
-    <w:lvlOverride w:ilvl="8">
-      <w:startOverride w:val="1"/>
-    </w:lvlOverride>
+    <w:abstractNumId w:val="991"/>
   </w:num>
 </w:numbering>
 </file>

</xml_diff>

<commit_message>
docs: second-round peer-feedback integration (v3.3 -> v3.4)
MUST-fixes:
- Response letter R2.3 quoted-text synced to manuscript v3.3 wording
- Table 2 column headers ("Standard" -> "Standard cases" etc.)
- §5.4 grammar fix on K-voting limitation sentence

Optional clarifications:
- §6.4 case-selection rationale (vessel+piping focus)
- §6.2 dataset-path note distinguishing 43- from 60-scenario sets

Strategic defensibility (Reviewer 1 risk minimisation):
- STRAT-1: framework-scope vs validated-scope explicit separation in §1, §7
- STRAT-2: real-plant evidence promoted with §6.6.3 body summary (Appendix A retained)
- STRAT-3: benchmark-construction independence acknowledged in §6.1
- STRAT-4: cover letter further compressed (~25% additional reduction)

Response letters EN + KO mirrored at R2.3, R1.3, R1.5.
Pandoc regenerated 3 upload docx + KO archive docx.
</commit_message>
<xml_diff>
--- a/docs/publication/submissions/jlp_revision_2026-05-08/COVER_LETTER_JLP_RESUBMISSION_v2.docx
+++ b/docs/publication/submissions/jlp_revision_2026-05-08/COVER_LETTER_JLP_RESUBMISSION_v2.docx
@@ -138,15 +138,7 @@
         <w:pStyle w:val="BodyText"/>
       </w:pPr>
       <w:r>
-        <w:t xml:space="preserve">Thank you for the opportunity to revise our manuscript JLP-D-26-00414, and please convey our gratitude to the three anonymous reviewers, whose detailed comments substantially strengthened the work. We are pleased to resubmit the revised manuscript together with a point-by-point Response to Reviewers letter.</w:t>
-      </w:r>
-    </w:p>
-    <w:p>
-      <w:pPr>
-        <w:pStyle w:val="BodyText"/>
-      </w:pPr>
-      <w:r>
-        <w:t xml:space="preserve">The revision addresses the structural concerns raised at review:</w:t>
+        <w:t xml:space="preserve">Thank you for the opportunity to revise JLP-D-26-00414; please convey our gratitude to the three anonymous reviewers, whose detailed comments substantially strengthened the work.</w:t>
       </w:r>
     </w:p>
     <w:p>
@@ -158,7 +150,7 @@
         </w:numPr>
       </w:pPr>
       <w:r>
-        <w:t xml:space="preserve">Reviewer concerns on comparison framing addressed via industry-baseline + internal layer ablation (§6.6).</w:t>
+        <w:t xml:space="preserve">Reviewer concerns on the absence of a comparison axis are addressed via an industry-baseline comparison and an internal four-layer ablation (§6.6, Tables 7 / 7b).</w:t>
       </w:r>
     </w:p>
     <w:p>
@@ -170,7 +162,7 @@
         </w:numPr>
       </w:pPr>
       <w:r>
-        <w:t xml:space="preserve">Synthetic-data positioning made honest via implementation-verification framing and a real-plant pipeline-execution case (§6.1, Appendix A).</w:t>
+        <w:t xml:space="preserve">Synthetic-only validation is reframed as implementation verification and supplemented by an anonymised real-plant pipeline-execution case (§6.1, Appendix A).</w:t>
       </w:r>
     </w:p>
     <w:p>
@@ -182,7 +174,7 @@
         </w:numPr>
       </w:pPr>
       <w:r>
-        <w:t xml:space="preserve">Statistical claims narrowed to those that survive paired-bootstrap 95% CI (§6.5, Table 6).</w:t>
+        <w:t xml:space="preserve">Statistical claims are narrowed to those that survive a paired-bootstrap 95% CI (§6.5, Table 6); honest weakness disclosure is reported in §8.</w:t>
       </w:r>
     </w:p>
     <w:p>
@@ -190,7 +182,7 @@
         <w:pStyle w:val="FirstParagraph"/>
       </w:pPr>
       <w:r>
-        <w:t xml:space="preserve">The full revision is reproducible end-to-end via</w:t>
+        <w:t xml:space="preserve">The full revision is reproducible via</w:t>
       </w:r>
       <w:r>
         <w:t xml:space="preserve"> </w:t>
@@ -205,7 +197,7 @@
         <w:t xml:space="preserve"> </w:t>
       </w:r>
       <w:r>
-        <w:t xml:space="preserve">(13/13 scripts pass on a clean checkout). All source code, golden datasets, the 60-scenario ablation set, the 50-query curated retrieval benchmark, and the SQLite FTS5 index manifest are publicly released under the AGPL-3.0 license. The manuscript remains exclusive to</w:t>
+        <w:t xml:space="preserve">(13/13 scripts pass) with all code, datasets, and the FTS5 index manifest released under AGPL-3.0. The manuscript is exclusive to</w:t>
       </w:r>
       <w:r>
         <w:t xml:space="preserve"> </w:t>
@@ -215,18 +207,10 @@
           <w:i/>
           <w:iCs/>
         </w:rPr>
-        <w:t xml:space="preserve">Journal of Loss Prevention in the Process Industries</w:t>
-      </w:r>
-      <w:r>
-        <w:t xml:space="preserve">; it has not been published or submitted elsewhere, and there are no conflicts of interest to declare.</w:t>
-      </w:r>
-    </w:p>
-    <w:p>
-      <w:pPr>
-        <w:pStyle w:val="BodyText"/>
-      </w:pPr>
-      <w:r>
-        <w:t xml:space="preserve">We look forward to your decision and to any further comments from the reviewers.</w:t>
+        <w:t xml:space="preserve">JLP</w:t>
+      </w:r>
+      <w:r>
+        <w:t xml:space="preserve">, has not been submitted elsewhere, and we declare no conflicts of interest.</w:t>
       </w:r>
     </w:p>
     <w:p>
@@ -258,13 +242,7 @@
         <w:t xml:space="preserve"> </w:t>
       </w:r>
       <w:r>
-        <w:t xml:space="preserve">M.S. Data, Insights &amp; Analytics Candidate; B.S. Chemical &amp; Biological Engineering</w:t>
-      </w:r>
-      <w:r>
-        <w:t xml:space="preserve"> </w:t>
-      </w:r>
-      <w:r>
-        <w:t xml:space="preserve">12+ years of professional experience in petrochemical EPC and process plant engineering</w:t>
+        <w:t xml:space="preserve">M.S. Data, Insights &amp; Analytics; B.S. Chemical &amp; Biological Engineering; 12+ yr petrochemical EPC.</w:t>
       </w:r>
       <w:r>
         <w:t xml:space="preserve"> </w:t>

</xml_diff>

<commit_message>
docs: final polish (v3.4 -> v3.5) — submit-ready
- Cover letter: 3 → 4 axis (comparison / synthetic / real-plant / claim narrowing)
  with bold action verbs and stronger first-line phrasing per axis
- §1 Scope statement: explicit **framework scope** vs **validated scope** bold
  highlighting; one-sentence tightening
- §6.6.3 first line: meta-explanation removed; replaced with action-first
  Headline ("UG-27 7.237 mm + Article 266 at rank 5") so a skim reader sees
  the real-plant outcome in the first sentence
- Final stale-token grep: zero hits (no leftover "synthetic + real-data dual",
  no "[reviewer 2's recommendation]", no 25/60 or 0.4167 leakage)

Pure polish; no new data, no new claims; numbers unchanged.
Pandoc regenerated 2 affected upload docx (manuscript + cover).

Co-Authored-By: Claude Opus 4.7 (1M context) <noreply@anthropic.com>
</commit_message>
<xml_diff>
--- a/docs/publication/submissions/jlp_revision_2026-05-08/COVER_LETTER_JLP_RESUBMISSION_v2.docx
+++ b/docs/publication/submissions/jlp_revision_2026-05-08/COVER_LETTER_JLP_RESUBMISSION_v2.docx
@@ -150,7 +150,23 @@
         </w:numPr>
       </w:pPr>
       <w:r>
-        <w:t xml:space="preserve">Reviewer concerns on the absence of a comparison axis are addressed via an industry-baseline comparison and an internal four-layer ablation (§6.6, Tables 7 / 7b).</w:t>
+        <w:rPr>
+          <w:b/>
+          <w:bCs/>
+        </w:rPr>
+        <w:t xml:space="preserve">Comparison axis added.</w:t>
+      </w:r>
+      <w:r>
+        <w:t xml:space="preserve"> </w:t>
+      </w:r>
+      <w:r>
+        <w:t xml:space="preserve">An industry-baseline comparison (</w:t>
+      </w:r>
+      <w:r>
+        <w:t xml:space="preserve">“ASME/API pass = compliance complete”</w:t>
+      </w:r>
+      <w:r>
+        <w:t xml:space="preserve">, 0/3 vs 3/3) and an internal four-layer ablation are now the spine of §6.6 (Tables 7, 7b).</w:t>
       </w:r>
     </w:p>
     <w:p>
@@ -162,7 +178,30 @@
         </w:numPr>
       </w:pPr>
       <w:r>
-        <w:t xml:space="preserve">Synthetic-only validation is reframed as implementation verification and supplemented by an anonymised real-plant pipeline-execution case (§6.1, Appendix A).</w:t>
+        <w:rPr>
+          <w:b/>
+          <w:bCs/>
+        </w:rPr>
+        <w:t xml:space="preserve">Synthetic framing corrected.</w:t>
+      </w:r>
+      <w:r>
+        <w:t xml:space="preserve"> </w:t>
+      </w:r>
+      <w:r>
+        <w:t xml:space="preserve">The 220-case headline is repositioned as</w:t>
+      </w:r>
+      <w:r>
+        <w:t xml:space="preserve"> </w:t>
+      </w:r>
+      <w:r>
+        <w:rPr>
+          <w:i/>
+          <w:iCs/>
+        </w:rPr>
+        <w:t xml:space="preserve">implementation verification, not predictive validation</w:t>
+      </w:r>
+      <w:r>
+        <w:t xml:space="preserve">, and supplemented by an anonymised real-plant pipeline-execution case (§6.1, §6.6.3, Appendix A).</w:t>
       </w:r>
     </w:p>
     <w:p>
@@ -174,7 +213,39 @@
         </w:numPr>
       </w:pPr>
       <w:r>
-        <w:t xml:space="preserve">Statistical claims are narrowed to those that survive a paired-bootstrap 95% CI (§6.5, Table 6); honest weakness disclosure is reported in §8.</w:t>
+        <w:rPr>
+          <w:b/>
+          <w:bCs/>
+        </w:rPr>
+        <w:t xml:space="preserve">Real-plant evidence promoted.</w:t>
+      </w:r>
+      <w:r>
+        <w:t xml:space="preserve"> </w:t>
+      </w:r>
+      <w:r>
+        <w:t xml:space="preserve">A new §6.6.3 summarises the VES-REAL-001 anonymised cryogenic flare-drum case so a body-text reader sees the real-data run without reaching the appendix; Article 266 (mandatory, flare-path block-valve prohibition) is surfaced naturally by the retrieval.</w:t>
+      </w:r>
+    </w:p>
+    <w:p>
+      <w:pPr>
+        <w:pStyle w:val="Compact"/>
+        <w:numPr>
+          <w:ilvl w:val="0"/>
+          <w:numId w:val="1001"/>
+        </w:numPr>
+      </w:pPr>
+      <w:r>
+        <w:rPr>
+          <w:b/>
+          <w:bCs/>
+        </w:rPr>
+        <w:t xml:space="preserve">Claims narrowed to what survives statistical scrutiny.</w:t>
+      </w:r>
+      <w:r>
+        <w:t xml:space="preserve"> </w:t>
+      </w:r>
+      <w:r>
+        <w:t xml:space="preserve">Headline retrieval is now Recall@1 and MRR@10, the two K values whose paired-bootstrap 95% CI excludes zero (§6.5, Table 6); §8 Limitations expand to eight items including framework-vs-validated scope and benchmark-construction independence.</w:t>
       </w:r>
     </w:p>
     <w:p>

</xml_diff>